<commit_message>
Clarify kappa, pooled models, and IRA row count
- Abstract: add pointer to Section 3.6 at first κ mention
- Section 2.4: explain that n=208 means 208 responses with two score
  columns each, not 418 stacked rows; show the 104+105-1=208 arithmetic
- Section 3.1: define "pooled models" before its first use in a table caption
- Section 3.6: add a plain-language definition of Cohen's Kappa (κ)
  including the conventional benchmark thresholds

Co-Authored-By: Claude Sonnet 4.6 (1M context) <noreply@anthropic.com>
</commit_message>
<xml_diff>
--- a/results/research_paper.docx
+++ b/results/research_paper.docx
@@ -68,7 +68,7 @@
         <w:t>professional</w:t>
       </w:r>
       <w:r>
-        <w:t xml:space="preserve"> framing, not novice. Prompt length improved recommendation specificity (short RS = 2.61 → long RS = 2.97) but plateaued quickly after a medium-length prompt. Claude produced more technically deep, more verbose responses; Codex was marginally more specific. Inter-rater reliability was strong for CC (κ = 0.622) and RS (κ = 0.548) but near-random for TD (κ = 0.109) — the dimension most central to the study's question. Bottom line: stating your expertise level to an AI does change what you get, particularly vocabulary level and assumed background, but not in the simple "more expert = better advice" pattern most users might expect.</w:t>
+        <w:t xml:space="preserve"> framing, not novice. Prompt length improved recommendation specificity (short RS = 2.61 → long RS = 2.97) but plateaued quickly after a medium-length prompt. Claude produced more technically deep, more verbose responses; Codex was marginally more specific. Inter-rater reliability was strong for CC (κ = 0.622) and RS (κ = 0.548) but near-random for TD (κ = 0.109) — the dimension most central to the study's question. (κ is Cohen's Kappa; see Section 3.6 for a full explanation.) Bottom line: stating your expertise level to an AI does change what you get, particularly vocabulary level and assumed background, but not in the simple "more expert = better advice" pattern most users might expect.</w:t>
       </w:r>
     </w:p>
     <w:p>
@@ -1421,7 +1421,7 @@
     </w:p>
     <w:p>
       <w:r>
-        <w:t>Each rater received the response text and the rubric and produced scores with brief justification notes. Raters were not shown each other's scores. The primary analysis uses Rater 1 (Claude Code) scores throughout for consistency; Rater 2 scores are used in the inter-rater reliability section. N = 208 paired rows (two response sets × 104 rows each, after excluding the Q7-PRO-S error row from both sets).</w:t>
+        <w:t>Each rater received the response text and the rubric and produced scores with brief justification notes. Raters were not shown each other's scores. The primary analysis uses Rater 1 (Claude Code) scores throughout for consistency; Rater 2 scores are used in the inter-rater reliability section. N = 208 paired rows — meaning 208 individual AI responses, each scored independently by both raters. Rater scores appear as two columns on the same row, not as separate rows, so the IRA dataset is 208 rows, not 418. For reference: the raw response count is 104 Claude + 105 Codex = 209 responses; Q7-PRO-S is excluded from both rater sets, leaving 208.</w:t>
       </w:r>
     </w:p>
     <w:p>
@@ -1476,6 +1476,20 @@
       </w:pPr>
       <w:r>
         <w:t>3.1 Effect of Expertise Framing</w:t>
+      </w:r>
+    </w:p>
+    <w:p>
+      <w:r>
+        <w:t xml:space="preserve">Throughout Sections 3.1, 3.2, and 3.4, </w:t>
+      </w:r>
+      <w:r>
+        <w:rPr>
+          <w:b/>
+        </w:rPr>
+        <w:t>pooled models</w:t>
+      </w:r>
+      <w:r>
+        <w:t xml:space="preserve"> means Claude and Codex responses are combined into a single dataset — 104 Claude rows and 105 Codex rows treated as one group — to isolate the effect of the variable being examined (framing or length) from model-level differences. Model-specific differences are reported separately in Section 3.3.</w:t>
       </w:r>
     </w:p>
     <w:p>
@@ -3399,6 +3413,17 @@
       </w:pPr>
       <w:r>
         <w:t>3.6 Inter-Rater Reliability</w:t>
+      </w:r>
+    </w:p>
+    <w:p>
+      <w:r>
+        <w:rPr>
+          <w:b/>
+        </w:rPr>
+        <w:t>Cohen's Kappa (κ)</w:t>
+      </w:r>
+      <w:r>
+        <w:t xml:space="preserve"> is a standard measure of agreement between two raters that corrects for chance. If two raters would agree 60% of the time just by guessing randomly, a raw 70% agreement rate isn't impressive — κ accounts for that baseline and reports only the agreement above chance. κ = 1.0 means perfect agreement; κ = 0.0 means agreement is no better than chance; negative κ means raters disagree more than chance would predict. Conventional benchmarks: &lt; 0.20 slight, 0.21–0.40 fair, 0.41–0.60 moderate, 0.61–0.80 substantial, &gt; 0.80 near-perfect. Linear-weighted κ (used here) gives partial credit for near-misses, so a 1-point disagreement is penalized less than a 3-point disagreement.</w:t>
       </w:r>
     </w:p>
     <w:p>

</xml_diff>

<commit_message>
Clarify MOD framing sentence and expand H0 explanation
- Section 3.5: spell out 'moderate framing level (MOD)' instead of bare 'MOD framing gap'
- Section 4.1 H0: add plain-language explanation of what 'framing' means
  in this context and walk through the specific conditions where H0 holds

Co-Authored-By: Claude Sonnet 4.6 (1M context) <noreply@anthropic.com>
</commit_message>
<xml_diff>
--- a/results/research_paper.docx
+++ b/results/research_paper.docx
@@ -3373,7 +3373,7 @@
         <w:t>The Claude disclaimer pattern.</w:t>
       </w:r>
       <w:r>
-        <w:t xml:space="preserve"> Nine Claude responses — spanning neutral, moderate, and expert framings at short and medium lengths — contained a boilerplate Claude Code interface disclaimer that mechanically added +1 to their CC score. This is a runner-environment artifact, not a genuine content signal. After adjusting for it, the Claude–Codex CC gap shrinks from 0.15 to approximately 0.06 overall, and the MOD framing gap closes to zero entirely. Without identifying this artifact, Claude would appear systematically more cautious than it actually is.</w:t>
+        <w:t xml:space="preserve"> Nine Claude responses — spanning neutral, moderate, and expert framings at short and medium lengths — contained a boilerplate Claude Code interface disclaimer that mechanically added +1 to their CC score. This is a runner-environment artifact, not a genuine content signal. After adjusting for it, the Claude–Codex CC gap shrinks from 0.15 to approximately 0.06 overall, and the gap between Claude and Codex at the moderate framing level (MOD) closes to zero entirely. Without identifying this artifact, Claude would appear systematically more cautious than it actually is.</w:t>
       </w:r>
     </w:p>
     <w:p>
@@ -3980,7 +3980,12 @@
     </w:p>
     <w:p>
       <w:r>
-        <w:t>For RS across all conditions and for CC under most conditions, framing produces negligible differences. For composting specifically, framing is essentially irrelevant. The meaningful framing effects are real, but they're concentrated in specific dimensions (TD, APK) and vary substantially by domain.</w:t>
+        <w:t>Here, "framing" refers specifically to the expertise prefix manipulation — the sentence added to the front of each prompt that declares who you are (novice, moderate, expert, etc.). H0 is the skeptical baseline: that those prefix sentences are essentially ignored, and the AI produces the same response regardless of whether you claim to be a complete beginner or a professional agronomist.</w:t>
+      </w:r>
+    </w:p>
+    <w:p>
+      <w:r>
+        <w:t>The data partially bears this out. For RS, framing made almost no difference across the board — scores stayed within a 0.04-point range (2.81 to 2.85) no matter who was asking. For CC, novice framing produced the exact same low-caveat responses as expert framing in most conditions. For the composting domain specifically, TD barely shifted at all across framing levels (range = 0.33 on a 5-point scale), meaning the AI gave essentially the same depth of response to a novice and a professional. So H0 holds in patches — the null result is real and worth acknowledging, even if TD and APK show that framing isn't completely ignored either.</w:t>
       </w:r>
     </w:p>
     <w:p>

</xml_diff>